<commit_message>
Adicionar novas preces: Vinde Espírito Criador, Oração São José Providencia e Ladainha a São José
</commit_message>
<xml_diff>
--- a/docs/05042026.docx
+++ b/docs/05042026.docx
@@ -8,223 +8,91 @@
       </w:r>
     </w:p>
     <w:p>
-      <w:pPr>
-        <w:rPr>
-          <w:b/>
-          <w:bCs/>
-        </w:rPr>
-      </w:pPr>
-      <w:r>
-        <w:rPr>
-          <w:b/>
-          <w:bCs/>
-        </w:rPr>
-        <w:t>(Domingo da Ressurreição na Páscoa Cristã)</w:t>
+      <w:r>
+        <w:rPr>
+          <w:b/>
+          <w:bCs/>
+        </w:rPr>
+        <w:t>Nesse dia, onde se revive Minha Gloriosa vitória sobre a morte, sobre a dor, sobre o pecado</w:t>
+      </w:r>
+      <w:r>
+        <w:rPr>
+          <w:b/>
+          <w:bCs/>
+        </w:rPr>
+        <w:t>.</w:t>
       </w:r>
     </w:p>
     <w:p>
       <w:pPr>
         <w:rPr>
-          <w:i/>
-          <w:iCs/>
+          <w:b/>
+          <w:bCs/>
         </w:rPr>
       </w:pPr>
       <w:r>
         <w:rPr>
-          <w:i/>
-          <w:iCs/>
-        </w:rPr>
-        <w:t>Jesus</w:t>
-      </w:r>
-      <w:r>
-        <w:rPr>
-          <w:i/>
-          <w:iCs/>
-        </w:rPr>
-        <w:t xml:space="preserve">, louvado sejas pela Vossa gloriosa </w:t>
-      </w:r>
-      <w:r>
-        <w:rPr>
-          <w:i/>
-          <w:iCs/>
-        </w:rPr>
-        <w:t>Ressureição, pois verdadeiramente estais vivo em</w:t>
-      </w:r>
-      <w:r>
-        <w:rPr>
-          <w:i/>
-          <w:iCs/>
-        </w:rPr>
-        <w:t xml:space="preserve"> nosso</w:t>
-      </w:r>
-      <w:r>
-        <w:rPr>
-          <w:i/>
-          <w:iCs/>
-        </w:rPr>
-        <w:t xml:space="preserve"> meio</w:t>
-      </w:r>
-      <w:r>
-        <w:rPr>
-          <w:i/>
-          <w:iCs/>
-        </w:rPr>
-        <w:t xml:space="preserve"> e para sempre com o Teu povo</w:t>
-      </w:r>
-      <w:r>
-        <w:rPr>
-          <w:i/>
-          <w:iCs/>
-        </w:rPr>
-        <w:t>.</w:t>
+          <w:b/>
+          <w:bCs/>
+        </w:rPr>
+        <w:t>(Domingo da Ressurreição na Páscoa Cristã)</w:t>
       </w:r>
     </w:p>
     <w:p>
       <w:pPr>
         <w:rPr>
-          <w:b/>
-          <w:bCs/>
+          <w:i/>
+          <w:iCs/>
         </w:rPr>
       </w:pPr>
       <w:r>
         <w:rPr>
-          <w:b/>
-          <w:bCs/>
-        </w:rPr>
-        <w:t>Amigo, aprende o caminho do amor: apenas ama o Teu Deus, Eu, e adora-Me, e isso te vai ser sempre</w:t>
-      </w:r>
-      <w:r>
-        <w:rPr>
-          <w:b/>
-          <w:bCs/>
-        </w:rPr>
-        <w:t xml:space="preserve"> o mais necessário, o que não se pode roubar e que </w:t>
-      </w:r>
-      <w:r>
-        <w:rPr>
-          <w:b/>
-          <w:bCs/>
-        </w:rPr>
-        <w:t>terás para sempre, pois é o verdadeiro amo</w:t>
-      </w:r>
-      <w:r>
-        <w:rPr>
-          <w:b/>
-          <w:bCs/>
-        </w:rPr>
-        <w:t xml:space="preserve">r pôr-se diante da Minha Santa Vida e adorando-Me servir-Me </w:t>
-      </w:r>
-      <w:r>
-        <w:rPr>
-          <w:b/>
-          <w:bCs/>
-        </w:rPr>
-        <w:t>escutando o Meu Sagrado Coração</w:t>
-      </w:r>
-      <w:r>
-        <w:rPr>
-          <w:b/>
-          <w:bCs/>
-        </w:rPr>
-        <w:t xml:space="preserve"> e </w:t>
-      </w:r>
-      <w:r>
-        <w:rPr>
-          <w:b/>
-          <w:bCs/>
-        </w:rPr>
-        <w:t>em Minha so</w:t>
-      </w:r>
-      <w:r>
-        <w:rPr>
-          <w:b/>
-          <w:bCs/>
-        </w:rPr>
-        <w:t>m</w:t>
-      </w:r>
-      <w:r>
-        <w:rPr>
-          <w:b/>
-          <w:bCs/>
-        </w:rPr>
-        <w:t>bra repousando teu coração</w:t>
-      </w:r>
-      <w:r>
-        <w:rPr>
-          <w:b/>
-          <w:bCs/>
-        </w:rPr>
-        <w:t xml:space="preserve"> em Mim</w:t>
-      </w:r>
-      <w:r>
-        <w:rPr>
-          <w:b/>
-          <w:bCs/>
-        </w:rPr>
-        <w:t xml:space="preserve">. </w:t>
-      </w:r>
-      <w:r>
-        <w:rPr>
-          <w:b/>
-          <w:bCs/>
-        </w:rPr>
-        <w:t>Este é o caminho da piedade mais elevada, olhar-Me</w:t>
-      </w:r>
-      <w:r>
-        <w:rPr>
-          <w:b/>
-          <w:bCs/>
-        </w:rPr>
-        <w:t xml:space="preserve"> e fitar os olhos nos Meus olhos, sem desviar-se, e ficarmos em um eterno enlevo de amor</w:t>
-      </w:r>
-      <w:r>
-        <w:rPr>
-          <w:b/>
-          <w:bCs/>
-        </w:rPr>
-        <w:t xml:space="preserve"> e paz perpétua</w:t>
-      </w:r>
-      <w:r>
-        <w:rPr>
-          <w:b/>
-          <w:bCs/>
-        </w:rPr>
-        <w:t>, deixando que Meu amor vença em ti para que</w:t>
-      </w:r>
-      <w:r>
-        <w:rPr>
-          <w:b/>
-          <w:bCs/>
-        </w:rPr>
-        <w:t xml:space="preserve"> Eu</w:t>
-      </w:r>
-      <w:r>
-        <w:rPr>
-          <w:b/>
-          <w:bCs/>
-        </w:rPr>
-        <w:t xml:space="preserve"> siga em vitória</w:t>
-      </w:r>
-      <w:r>
-        <w:rPr>
-          <w:b/>
-          <w:bCs/>
-        </w:rPr>
-        <w:t xml:space="preserve"> também</w:t>
-      </w:r>
-      <w:r>
-        <w:rPr>
-          <w:b/>
-          <w:bCs/>
-        </w:rPr>
-        <w:t xml:space="preserve"> em muitos</w:t>
-      </w:r>
-      <w:r>
-        <w:rPr>
-          <w:b/>
-          <w:bCs/>
-        </w:rPr>
-        <w:t xml:space="preserve">. </w:t>
+          <w:i/>
+          <w:iCs/>
+        </w:rPr>
+        <w:t>Jesus</w:t>
+      </w:r>
+      <w:r>
+        <w:rPr>
+          <w:i/>
+          <w:iCs/>
+        </w:rPr>
+        <w:t xml:space="preserve">, louvado sejas pela Vossa gloriosa </w:t>
+      </w:r>
+      <w:r>
+        <w:rPr>
+          <w:i/>
+          <w:iCs/>
+        </w:rPr>
+        <w:t>Ressureição, pois verdadeiramente estais vivo em</w:t>
+      </w:r>
+      <w:r>
+        <w:rPr>
+          <w:i/>
+          <w:iCs/>
+        </w:rPr>
+        <w:t xml:space="preserve"> nosso</w:t>
+      </w:r>
+      <w:r>
+        <w:rPr>
+          <w:i/>
+          <w:iCs/>
+        </w:rPr>
+        <w:t xml:space="preserve"> meio</w:t>
+      </w:r>
+      <w:r>
+        <w:rPr>
+          <w:i/>
+          <w:iCs/>
+        </w:rPr>
+        <w:t xml:space="preserve"> e para sempre com o Teu povo</w:t>
+      </w:r>
+      <w:r>
+        <w:rPr>
+          <w:i/>
+          <w:iCs/>
+        </w:rPr>
+        <w:t>.</w:t>
       </w:r>
     </w:p>
     <w:p>
@@ -239,140 +107,140 @@
           <w:b/>
           <w:bCs/>
         </w:rPr>
-        <w:t xml:space="preserve">Nesse dia, onde </w:t>
-      </w:r>
-      <w:r>
-        <w:rPr>
-          <w:b/>
-          <w:bCs/>
-        </w:rPr>
-        <w:t xml:space="preserve">se </w:t>
-      </w:r>
-      <w:r>
-        <w:rPr>
-          <w:b/>
-          <w:bCs/>
-        </w:rPr>
-        <w:t>revive Minha Gloriosa vitória sobre a morte, sobre a dor, sobre o pecado e ministro a Minha Ressurreição em Meu Povo, que compõe Meu Corpo Místico, venho reaviar em ti a alegria, venho curar-te e formar tuas células</w:t>
-      </w:r>
-      <w:r>
-        <w:rPr>
-          <w:b/>
-          <w:bCs/>
-        </w:rPr>
-        <w:t xml:space="preserve"> com a vida da Nova Jerusalém, uma </w:t>
-      </w:r>
-      <w:r>
-        <w:rPr>
-          <w:b/>
-          <w:bCs/>
-        </w:rPr>
-        <w:t>v</w:t>
-      </w:r>
-      <w:r>
-        <w:rPr>
-          <w:b/>
-          <w:bCs/>
-        </w:rPr>
-        <w:t>ida repleta do Espírito Santo, onde vives e respiras</w:t>
-      </w:r>
-      <w:r>
-        <w:rPr>
-          <w:b/>
-          <w:bCs/>
-        </w:rPr>
-        <w:t xml:space="preserve"> não mais com as marcas do pecado das origens dominando tua vida material e a tua vida imaterial, pois tudo foi realizado e completado em M</w:t>
-      </w:r>
-      <w:r>
-        <w:rPr>
-          <w:b/>
-          <w:bCs/>
-        </w:rPr>
-        <w:t>inha</w:t>
-      </w:r>
-      <w:r>
-        <w:rPr>
-          <w:b/>
-          <w:bCs/>
-        </w:rPr>
-        <w:t xml:space="preserve"> </w:t>
-      </w:r>
-      <w:r>
-        <w:rPr>
-          <w:b/>
-          <w:bCs/>
-        </w:rPr>
-        <w:t>Santa</w:t>
-      </w:r>
-      <w:r>
-        <w:rPr>
-          <w:b/>
-          <w:bCs/>
-        </w:rPr>
-        <w:t xml:space="preserve"> Vida,</w:t>
-      </w:r>
-      <w:r>
-        <w:rPr>
-          <w:b/>
-          <w:bCs/>
-        </w:rPr>
-        <w:t xml:space="preserve"> Paixão, morte</w:t>
-      </w:r>
-      <w:r>
-        <w:rPr>
-          <w:b/>
-          <w:bCs/>
-        </w:rPr>
-        <w:t>,</w:t>
-      </w:r>
-      <w:r>
-        <w:rPr>
-          <w:b/>
-          <w:bCs/>
-        </w:rPr>
-        <w:t xml:space="preserve"> Ressurreição</w:t>
-      </w:r>
-      <w:r>
-        <w:rPr>
-          <w:b/>
-          <w:bCs/>
-        </w:rPr>
-        <w:t xml:space="preserve"> e Ascensão ao Céu</w:t>
-      </w:r>
-      <w:r>
-        <w:rPr>
-          <w:b/>
-          <w:bCs/>
-        </w:rPr>
-        <w:t xml:space="preserve">, e arranquei de tua </w:t>
-      </w:r>
-      <w:r>
-        <w:rPr>
-          <w:b/>
-          <w:bCs/>
-        </w:rPr>
-        <w:t xml:space="preserve">pobre condição a raiz de toda tristeza, dor e engano, </w:t>
-      </w:r>
-      <w:r>
-        <w:rPr>
-          <w:b/>
-          <w:bCs/>
-        </w:rPr>
-        <w:t>que é o pecado original e seu</w:t>
-      </w:r>
-      <w:r>
-        <w:rPr>
-          <w:b/>
-          <w:bCs/>
-        </w:rPr>
-        <w:t>s</w:t>
-      </w:r>
-      <w:r>
-        <w:rPr>
-          <w:b/>
-          <w:bCs/>
-        </w:rPr>
-        <w:t xml:space="preserve"> frutos, dando-te o perdão verdadeiro que jorra do Meu Coração Misericordioso.</w:t>
+        <w:t>Amigo, aprende o caminho do amor: apenas ama o Teu Deus, Eu, e adora-Me, e isso te vai ser sempre</w:t>
+      </w:r>
+      <w:r>
+        <w:rPr>
+          <w:b/>
+          <w:bCs/>
+        </w:rPr>
+        <w:t xml:space="preserve"> o mais necessário, o que não se pode roubar e que </w:t>
+      </w:r>
+      <w:r>
+        <w:rPr>
+          <w:b/>
+          <w:bCs/>
+        </w:rPr>
+        <w:t>terás para sempre, pois é o verdadeiro amo</w:t>
+      </w:r>
+      <w:r>
+        <w:rPr>
+          <w:b/>
+          <w:bCs/>
+        </w:rPr>
+        <w:t xml:space="preserve">r pôr-se diante da Minha Santa Vida e adorando-Me servir-Me </w:t>
+      </w:r>
+      <w:r>
+        <w:rPr>
+          <w:b/>
+          <w:bCs/>
+        </w:rPr>
+        <w:t>escutando o Meu Sagrado Coração</w:t>
+      </w:r>
+      <w:r>
+        <w:rPr>
+          <w:b/>
+          <w:bCs/>
+        </w:rPr>
+        <w:t xml:space="preserve"> e </w:t>
+      </w:r>
+      <w:r>
+        <w:rPr>
+          <w:b/>
+          <w:bCs/>
+        </w:rPr>
+        <w:t>em Minha so</w:t>
+      </w:r>
+      <w:r>
+        <w:rPr>
+          <w:b/>
+          <w:bCs/>
+        </w:rPr>
+        <w:t>m</w:t>
+      </w:r>
+      <w:r>
+        <w:rPr>
+          <w:b/>
+          <w:bCs/>
+        </w:rPr>
+        <w:t>bra repousando teu coração</w:t>
+      </w:r>
+      <w:r>
+        <w:rPr>
+          <w:b/>
+          <w:bCs/>
+        </w:rPr>
+        <w:t xml:space="preserve"> em Mim</w:t>
+      </w:r>
+      <w:r>
+        <w:rPr>
+          <w:b/>
+          <w:bCs/>
+        </w:rPr>
+        <w:t xml:space="preserve">. </w:t>
+      </w:r>
+      <w:r>
+        <w:rPr>
+          <w:b/>
+          <w:bCs/>
+        </w:rPr>
+        <w:t>Este é o caminho da piedade mais elevada, olhar-Me</w:t>
+      </w:r>
+      <w:r>
+        <w:rPr>
+          <w:b/>
+          <w:bCs/>
+        </w:rPr>
+        <w:t xml:space="preserve"> e fitar os olhos nos Meus olhos, sem desviar-se, e ficarmos em um eterno enlevo de amor</w:t>
+      </w:r>
+      <w:r>
+        <w:rPr>
+          <w:b/>
+          <w:bCs/>
+        </w:rPr>
+        <w:t xml:space="preserve"> e paz perpétua</w:t>
+      </w:r>
+      <w:r>
+        <w:rPr>
+          <w:b/>
+          <w:bCs/>
+        </w:rPr>
+        <w:t>, deixando que Meu amor vença em ti para que</w:t>
+      </w:r>
+      <w:r>
+        <w:rPr>
+          <w:b/>
+          <w:bCs/>
+        </w:rPr>
+        <w:t xml:space="preserve"> Eu</w:t>
+      </w:r>
+      <w:r>
+        <w:rPr>
+          <w:b/>
+          <w:bCs/>
+        </w:rPr>
+        <w:t xml:space="preserve"> siga em vitória</w:t>
+      </w:r>
+      <w:r>
+        <w:rPr>
+          <w:b/>
+          <w:bCs/>
+        </w:rPr>
+        <w:t xml:space="preserve"> também</w:t>
+      </w:r>
+      <w:r>
+        <w:rPr>
+          <w:b/>
+          <w:bCs/>
+        </w:rPr>
+        <w:t xml:space="preserve"> em muitos</w:t>
+      </w:r>
+      <w:r>
+        <w:rPr>
+          <w:b/>
+          <w:bCs/>
+        </w:rPr>
+        <w:t xml:space="preserve">. </w:t>
       </w:r>
     </w:p>
     <w:p>
@@ -387,84 +255,140 @@
           <w:b/>
           <w:bCs/>
         </w:rPr>
-        <w:t>Eu venci o pecado, a dor e a morte para que possais estar livres de tais males e possais ser deificados, participando de Minha deidade</w:t>
-      </w:r>
-      <w:r>
-        <w:rPr>
-          <w:b/>
-          <w:bCs/>
-        </w:rPr>
-        <w:t xml:space="preserve">, e não mais tendo enraizado em si o pecado original, o qual </w:t>
-      </w:r>
-      <w:r>
-        <w:rPr>
-          <w:b/>
-          <w:bCs/>
-        </w:rPr>
-        <w:t xml:space="preserve">extirpei de vossas vidas, o arranquei de vossos membros, venci suas </w:t>
-      </w:r>
-      <w:r>
-        <w:rPr>
-          <w:b/>
-          <w:bCs/>
-        </w:rPr>
-        <w:t>consequências, até a maior delas, a morte</w:t>
-      </w:r>
-      <w:r>
-        <w:rPr>
-          <w:b/>
-          <w:bCs/>
-        </w:rPr>
-        <w:t>;</w:t>
-      </w:r>
-      <w:r>
-        <w:rPr>
-          <w:b/>
-          <w:bCs/>
-        </w:rPr>
-        <w:t xml:space="preserve"> ressu</w:t>
-      </w:r>
-      <w:r>
-        <w:rPr>
-          <w:b/>
-          <w:bCs/>
-        </w:rPr>
-        <w:t>rgindo da morte</w:t>
-      </w:r>
-      <w:r>
-        <w:rPr>
-          <w:b/>
-          <w:bCs/>
-        </w:rPr>
-        <w:t xml:space="preserve"> e subi aos Céu para que possais vós ter acesso ao Céu, e não se diga que o Céu está inacessível</w:t>
-      </w:r>
-      <w:r>
-        <w:rPr>
-          <w:b/>
-          <w:bCs/>
-        </w:rPr>
-        <w:t>, pois Eu, o Céu vim até vós e elevei-vos ao Céu</w:t>
-      </w:r>
-      <w:r>
-        <w:rPr>
-          <w:b/>
-          <w:bCs/>
-        </w:rPr>
-        <w:t xml:space="preserve"> em Minha gloriosa </w:t>
-      </w:r>
-      <w:r>
-        <w:rPr>
-          <w:b/>
-          <w:bCs/>
-        </w:rPr>
-        <w:t>A</w:t>
-      </w:r>
-      <w:r>
-        <w:rPr>
-          <w:b/>
-          <w:bCs/>
-        </w:rPr>
-        <w:t>scensão ao Céu.</w:t>
+        <w:t xml:space="preserve">Nesse dia, onde </w:t>
+      </w:r>
+      <w:r>
+        <w:rPr>
+          <w:b/>
+          <w:bCs/>
+        </w:rPr>
+        <w:t xml:space="preserve">se </w:t>
+      </w:r>
+      <w:r>
+        <w:rPr>
+          <w:b/>
+          <w:bCs/>
+        </w:rPr>
+        <w:t>revive Minha Gloriosa vitória sobre a morte, sobre a dor, sobre o pecado e ministro a Minha Ressurreição em Meu Povo, que compõe Meu Corpo Místico, venho reaviar em ti a alegria, venho curar-te e formar tuas células</w:t>
+      </w:r>
+      <w:r>
+        <w:rPr>
+          <w:b/>
+          <w:bCs/>
+        </w:rPr>
+        <w:t xml:space="preserve"> com a vida da Nova Jerusalém, uma </w:t>
+      </w:r>
+      <w:r>
+        <w:rPr>
+          <w:b/>
+          <w:bCs/>
+        </w:rPr>
+        <w:t>v</w:t>
+      </w:r>
+      <w:r>
+        <w:rPr>
+          <w:b/>
+          <w:bCs/>
+        </w:rPr>
+        <w:t>ida repleta do Espírito Santo, onde vives e respiras</w:t>
+      </w:r>
+      <w:r>
+        <w:rPr>
+          <w:b/>
+          <w:bCs/>
+        </w:rPr>
+        <w:t xml:space="preserve"> não mais com as marcas do pecado das origens dominando tua vida material e a tua vida imaterial, pois tudo foi realizado e completado em M</w:t>
+      </w:r>
+      <w:r>
+        <w:rPr>
+          <w:b/>
+          <w:bCs/>
+        </w:rPr>
+        <w:t>inha</w:t>
+      </w:r>
+      <w:r>
+        <w:rPr>
+          <w:b/>
+          <w:bCs/>
+        </w:rPr>
+        <w:t xml:space="preserve"> </w:t>
+      </w:r>
+      <w:r>
+        <w:rPr>
+          <w:b/>
+          <w:bCs/>
+        </w:rPr>
+        <w:t>Santa</w:t>
+      </w:r>
+      <w:r>
+        <w:rPr>
+          <w:b/>
+          <w:bCs/>
+        </w:rPr>
+        <w:t xml:space="preserve"> Vida,</w:t>
+      </w:r>
+      <w:r>
+        <w:rPr>
+          <w:b/>
+          <w:bCs/>
+        </w:rPr>
+        <w:t xml:space="preserve"> Paixão, morte</w:t>
+      </w:r>
+      <w:r>
+        <w:rPr>
+          <w:b/>
+          <w:bCs/>
+        </w:rPr>
+        <w:t>,</w:t>
+      </w:r>
+      <w:r>
+        <w:rPr>
+          <w:b/>
+          <w:bCs/>
+        </w:rPr>
+        <w:t xml:space="preserve"> Ressurreição</w:t>
+      </w:r>
+      <w:r>
+        <w:rPr>
+          <w:b/>
+          <w:bCs/>
+        </w:rPr>
+        <w:t xml:space="preserve"> e Ascensão ao Céu</w:t>
+      </w:r>
+      <w:r>
+        <w:rPr>
+          <w:b/>
+          <w:bCs/>
+        </w:rPr>
+        <w:t xml:space="preserve">, e arranquei de tua </w:t>
+      </w:r>
+      <w:r>
+        <w:rPr>
+          <w:b/>
+          <w:bCs/>
+        </w:rPr>
+        <w:t xml:space="preserve">pobre condição a raiz de toda tristeza, dor e engano, </w:t>
+      </w:r>
+      <w:r>
+        <w:rPr>
+          <w:b/>
+          <w:bCs/>
+        </w:rPr>
+        <w:t>que é o pecado original e seu</w:t>
+      </w:r>
+      <w:r>
+        <w:rPr>
+          <w:b/>
+          <w:bCs/>
+        </w:rPr>
+        <w:t>s</w:t>
+      </w:r>
+      <w:r>
+        <w:rPr>
+          <w:b/>
+          <w:bCs/>
+        </w:rPr>
+        <w:t xml:space="preserve"> frutos, dando-te o perdão verdadeiro que jorra do Meu Coração Misericordioso.</w:t>
       </w:r>
     </w:p>
     <w:p>
@@ -479,28 +403,84 @@
           <w:b/>
           <w:bCs/>
         </w:rPr>
-        <w:t>Nesse mistério de Minha Ressurreição gloriosa refiz vosso organismo em cada célula, em cada tecido e fibra, tecendo em vós a vida</w:t>
-      </w:r>
-      <w:r>
-        <w:rPr>
-          <w:b/>
-          <w:bCs/>
-        </w:rPr>
-        <w:t xml:space="preserve"> livre da escravidão do pecado e de suas </w:t>
-      </w:r>
-      <w:r>
-        <w:rPr>
-          <w:b/>
-          <w:bCs/>
-        </w:rPr>
-        <w:t xml:space="preserve">consequências, e tudo isso, pelo Mesmo Espírito </w:t>
-      </w:r>
-      <w:r>
-        <w:rPr>
-          <w:b/>
-          <w:bCs/>
-        </w:rPr>
-        <w:t>que ressurgiu-Me da morte, pois o Espírito Santo é quem vos vivifica e vos doa a vida.</w:t>
+        <w:t>Eu venci o pecado, a dor e a morte para que possais estar livres de tais males e possais ser deificados, participando de Minha deidade</w:t>
+      </w:r>
+      <w:r>
+        <w:rPr>
+          <w:b/>
+          <w:bCs/>
+        </w:rPr>
+        <w:t xml:space="preserve">, e não mais tendo enraizado em si o pecado original, o qual </w:t>
+      </w:r>
+      <w:r>
+        <w:rPr>
+          <w:b/>
+          <w:bCs/>
+        </w:rPr>
+        <w:t xml:space="preserve">extirpei de vossas vidas, o arranquei de vossos membros, venci suas </w:t>
+      </w:r>
+      <w:r>
+        <w:rPr>
+          <w:b/>
+          <w:bCs/>
+        </w:rPr>
+        <w:t>consequências, até a maior delas, a morte</w:t>
+      </w:r>
+      <w:r>
+        <w:rPr>
+          <w:b/>
+          <w:bCs/>
+        </w:rPr>
+        <w:t>;</w:t>
+      </w:r>
+      <w:r>
+        <w:rPr>
+          <w:b/>
+          <w:bCs/>
+        </w:rPr>
+        <w:t xml:space="preserve"> ressu</w:t>
+      </w:r>
+      <w:r>
+        <w:rPr>
+          <w:b/>
+          <w:bCs/>
+        </w:rPr>
+        <w:t>rgindo da morte</w:t>
+      </w:r>
+      <w:r>
+        <w:rPr>
+          <w:b/>
+          <w:bCs/>
+        </w:rPr>
+        <w:t xml:space="preserve"> e subi aos Céu para que possais vós ter acesso ao Céu, e não se diga que o Céu está inacessível</w:t>
+      </w:r>
+      <w:r>
+        <w:rPr>
+          <w:b/>
+          <w:bCs/>
+        </w:rPr>
+        <w:t>, pois Eu, o Céu vim até vós e elevei-vos ao Céu</w:t>
+      </w:r>
+      <w:r>
+        <w:rPr>
+          <w:b/>
+          <w:bCs/>
+        </w:rPr>
+        <w:t xml:space="preserve"> em Minha gloriosa </w:t>
+      </w:r>
+      <w:r>
+        <w:rPr>
+          <w:b/>
+          <w:bCs/>
+        </w:rPr>
+        <w:t>A</w:t>
+      </w:r>
+      <w:r>
+        <w:rPr>
+          <w:b/>
+          <w:bCs/>
+        </w:rPr>
+        <w:t>scensão ao Céu.</w:t>
       </w:r>
     </w:p>
     <w:p>
@@ -515,85 +495,28 @@
           <w:b/>
           <w:bCs/>
         </w:rPr>
-        <w:t>Pois bem, nesse dia célebre</w:t>
-      </w:r>
-      <w:r>
-        <w:rPr>
-          <w:b/>
-          <w:bCs/>
-        </w:rPr>
-        <w:t>, amado amigo, refaço-te por inteiro e curo tua alma, corpo e espírito, retirando de ti o nom</w:t>
-      </w:r>
-      <w:r>
-        <w:rPr>
-          <w:b/>
-          <w:bCs/>
-        </w:rPr>
-        <w:t>e de enfermo e mazelado</w:t>
-      </w:r>
-      <w:r>
-        <w:rPr>
-          <w:b/>
-          <w:bCs/>
-        </w:rPr>
-        <w:t xml:space="preserve"> pela maldição do pecado</w:t>
-      </w:r>
-      <w:r>
-        <w:rPr>
-          <w:b/>
-          <w:bCs/>
-        </w:rPr>
-        <w:t xml:space="preserve">, pois o Espírito Santo </w:t>
-      </w:r>
-      <w:r>
-        <w:rPr>
-          <w:b/>
-          <w:bCs/>
-        </w:rPr>
-        <w:t xml:space="preserve">vem </w:t>
-      </w:r>
-      <w:r>
-        <w:rPr>
-          <w:b/>
-          <w:bCs/>
-        </w:rPr>
-        <w:lastRenderedPageBreak/>
-        <w:t>realizar em ti, realmente, a verdadeira libertação da Páscoa Cristã</w:t>
-      </w:r>
-      <w:r>
-        <w:rPr>
-          <w:b/>
-          <w:bCs/>
-        </w:rPr>
-        <w:t>,</w:t>
-      </w:r>
-      <w:r>
-        <w:rPr>
-          <w:b/>
-          <w:bCs/>
-        </w:rPr>
-        <w:t xml:space="preserve"> dando-te o nome feliz e bendito de Minha Santa Casa,</w:t>
-      </w:r>
-      <w:r>
-        <w:rPr>
-          <w:b/>
-          <w:bCs/>
-        </w:rPr>
-        <w:t xml:space="preserve"> que liberta da mancha do pecado e das raízes do pecado das origens, bem como vem sanar os da</w:t>
-      </w:r>
-      <w:r>
-        <w:rPr>
-          <w:b/>
-          <w:bCs/>
-        </w:rPr>
-        <w:t>n</w:t>
-      </w:r>
-      <w:r>
-        <w:rPr>
-          <w:b/>
-          <w:bCs/>
-        </w:rPr>
-        <w:t>os que tal mal vos causou, e isso tudo é um prodígio de misericórdia.</w:t>
+        <w:t>Nesse mistério de Minha Ressurreição gloriosa refiz vosso organismo em cada célula, em cada tecido e fibra, tecendo em vós a vida</w:t>
+      </w:r>
+      <w:r>
+        <w:rPr>
+          <w:b/>
+          <w:bCs/>
+        </w:rPr>
+        <w:t xml:space="preserve"> livre da escravidão do pecado e de suas </w:t>
+      </w:r>
+      <w:r>
+        <w:rPr>
+          <w:b/>
+          <w:bCs/>
+        </w:rPr>
+        <w:t xml:space="preserve">consequências, e tudo isso, pelo Mesmo Espírito </w:t>
+      </w:r>
+      <w:r>
+        <w:rPr>
+          <w:b/>
+          <w:bCs/>
+        </w:rPr>
+        <w:t>que ressurgiu-Me da morte, pois o Espírito Santo é quem vos vivifica e vos doa a vida.</w:t>
       </w:r>
     </w:p>
     <w:p>
@@ -608,28 +531,78 @@
           <w:b/>
           <w:bCs/>
         </w:rPr>
-        <w:t>Saquearam Minha Casa, mas tu és ainda um pequeno resto que permaneceu-Me fiel</w:t>
-      </w:r>
-      <w:r>
-        <w:rPr>
-          <w:b/>
-          <w:bCs/>
-        </w:rPr>
-        <w:t>. Não temas</w:t>
-      </w:r>
-      <w:r>
-        <w:rPr>
-          <w:b/>
-          <w:bCs/>
-        </w:rPr>
-        <w:t>, pois terás fortaleza para recusar sempre o mal e o pecado e dizer sim à Santa vontade do Pai, pois ela vos alimentará e sempre estarás saciado por ela</w:t>
-      </w:r>
-      <w:r>
-        <w:rPr>
-          <w:b/>
-          <w:bCs/>
-        </w:rPr>
-        <w:t>.</w:t>
+        <w:lastRenderedPageBreak/>
+        <w:t>Pois bem, nesse dia célebre</w:t>
+      </w:r>
+      <w:r>
+        <w:rPr>
+          <w:b/>
+          <w:bCs/>
+        </w:rPr>
+        <w:t>, amado amigo, refaço-te por inteiro e curo tua alma, corpo e espírito, retirando de ti o nom</w:t>
+      </w:r>
+      <w:r>
+        <w:rPr>
+          <w:b/>
+          <w:bCs/>
+        </w:rPr>
+        <w:t>e de enfermo e mazelado</w:t>
+      </w:r>
+      <w:r>
+        <w:rPr>
+          <w:b/>
+          <w:bCs/>
+        </w:rPr>
+        <w:t xml:space="preserve"> pela maldição do pecado</w:t>
+      </w:r>
+      <w:r>
+        <w:rPr>
+          <w:b/>
+          <w:bCs/>
+        </w:rPr>
+        <w:t xml:space="preserve">, pois o Espírito Santo </w:t>
+      </w:r>
+      <w:r>
+        <w:rPr>
+          <w:b/>
+          <w:bCs/>
+        </w:rPr>
+        <w:t>vem realizar em ti, realmente, a verdadeira libertação da Páscoa Cristã</w:t>
+      </w:r>
+      <w:r>
+        <w:rPr>
+          <w:b/>
+          <w:bCs/>
+        </w:rPr>
+        <w:t>,</w:t>
+      </w:r>
+      <w:r>
+        <w:rPr>
+          <w:b/>
+          <w:bCs/>
+        </w:rPr>
+        <w:t xml:space="preserve"> dando-te o nome feliz e bendito de Minha Santa Casa,</w:t>
+      </w:r>
+      <w:r>
+        <w:rPr>
+          <w:b/>
+          <w:bCs/>
+        </w:rPr>
+        <w:t xml:space="preserve"> que liberta da mancha do pecado e das raízes do pecado das origens, bem como vem sanar os da</w:t>
+      </w:r>
+      <w:r>
+        <w:rPr>
+          <w:b/>
+          <w:bCs/>
+        </w:rPr>
+        <w:t>n</w:t>
+      </w:r>
+      <w:r>
+        <w:rPr>
+          <w:b/>
+          <w:bCs/>
+        </w:rPr>
+        <w:t>os que tal mal vos causou, e isso tudo é um prodígio de misericórdia.</w:t>
       </w:r>
     </w:p>
     <w:p>
@@ -644,153 +617,28 @@
           <w:b/>
           <w:bCs/>
         </w:rPr>
-        <w:t>Ainda quero dizer-te que</w:t>
-      </w:r>
-      <w:r>
-        <w:rPr>
-          <w:b/>
-          <w:bCs/>
-        </w:rPr>
-        <w:t xml:space="preserve"> em Roma será feito um laço com a impiedade, e será visto isso por todos, será noticiado e se verá claramente pelos frutos</w:t>
-      </w:r>
-      <w:r>
-        <w:rPr>
-          <w:b/>
-          <w:bCs/>
-        </w:rPr>
-        <w:t xml:space="preserve">, pois o Homem Iníquo </w:t>
-      </w:r>
-      <w:r>
-        <w:t>(falado nas escrituras)</w:t>
-      </w:r>
-      <w:r>
-        <w:t xml:space="preserve"> </w:t>
-      </w:r>
-      <w:r>
-        <w:rPr>
-          <w:b/>
-          <w:bCs/>
-        </w:rPr>
-        <w:t>em muito breve aparecerá, porá suas garras em Minha Roma ferida</w:t>
-      </w:r>
-      <w:r>
-        <w:rPr>
-          <w:b/>
-          <w:bCs/>
-        </w:rPr>
-        <w:t xml:space="preserve"> pela apostasia, e relembrará vivamente aos Homens que</w:t>
-      </w:r>
-      <w:r>
-        <w:rPr>
-          <w:b/>
-          <w:bCs/>
-        </w:rPr>
-        <w:t xml:space="preserve"> povoam a Terra que realmente os poderes do </w:t>
-      </w:r>
-      <w:r>
-        <w:rPr>
-          <w:b/>
-          <w:bCs/>
-        </w:rPr>
-        <w:t>c</w:t>
-      </w:r>
-      <w:r>
-        <w:rPr>
-          <w:b/>
-          <w:bCs/>
-        </w:rPr>
-        <w:t>éu</w:t>
-      </w:r>
-      <w:r>
-        <w:rPr>
-          <w:b/>
-          <w:bCs/>
-        </w:rPr>
-        <w:t>s</w:t>
-      </w:r>
-      <w:r>
-        <w:rPr>
-          <w:b/>
-          <w:bCs/>
-        </w:rPr>
-        <w:t xml:space="preserve"> </w:t>
-      </w:r>
-      <w:r>
-        <w:rPr>
-          <w:b/>
-          <w:bCs/>
-        </w:rPr>
-        <w:t>em verdade</w:t>
-      </w:r>
-      <w:r>
-        <w:rPr>
-          <w:b/>
-          <w:bCs/>
-        </w:rPr>
-        <w:t xml:space="preserve"> estão abalados e que a iniquidade avançou já a um grau ao qual precisará retroceder</w:t>
-      </w:r>
-      <w:r>
-        <w:rPr>
-          <w:b/>
-          <w:bCs/>
-        </w:rPr>
-        <w:t xml:space="preserve"> para que não seja tarde demais, e farei com que retroceda, pois começarei a desfazer, definitivamente, o </w:t>
-      </w:r>
-      <w:r>
-        <w:rPr>
-          <w:b/>
-          <w:bCs/>
-        </w:rPr>
-        <w:t xml:space="preserve">caminho do pecado até o coração dos Homens, e aos que se arrependerem, será dada a paz, mais aos que não se </w:t>
-      </w:r>
-      <w:r>
-        <w:rPr>
-          <w:b/>
-          <w:bCs/>
-        </w:rPr>
-        <w:t>arrependerem</w:t>
-      </w:r>
-      <w:r>
-        <w:rPr>
-          <w:b/>
-          <w:bCs/>
-        </w:rPr>
-        <w:t>, virá a grande tribulação</w:t>
-      </w:r>
-      <w:r>
-        <w:rPr>
-          <w:b/>
-          <w:bCs/>
-        </w:rPr>
-        <w:t xml:space="preserve"> que predisse no Santo Evangelho</w:t>
-      </w:r>
-      <w:r>
-        <w:rPr>
-          <w:b/>
-          <w:bCs/>
-        </w:rPr>
-        <w:t xml:space="preserve">, e haverá esperança, porém, não passará esse tempo sem que existam dores de parto e choro </w:t>
-      </w:r>
-      <w:r>
-        <w:rPr>
-          <w:b/>
-          <w:bCs/>
-        </w:rPr>
-        <w:t>a muitos em toda a face da Terra.</w:t>
-      </w:r>
-      <w:r>
-        <w:rPr>
-          <w:b/>
-          <w:bCs/>
-        </w:rPr>
-        <w:t xml:space="preserve"> </w:t>
-      </w:r>
-      <w:r>
-        <w:rPr>
-          <w:b/>
-          <w:bCs/>
-        </w:rPr>
-        <w:t xml:space="preserve"> </w:t>
+        <w:t>Saquearam Minha Casa, mas tu és ainda um pequeno resto que permaneceu-Me fiel</w:t>
+      </w:r>
+      <w:r>
+        <w:rPr>
+          <w:b/>
+          <w:bCs/>
+        </w:rPr>
+        <w:t>. Não temas</w:t>
+      </w:r>
+      <w:r>
+        <w:rPr>
+          <w:b/>
+          <w:bCs/>
+        </w:rPr>
+        <w:t>, pois terás fortaleza para recusar sempre o mal e o pecado e dizer sim à Santa vontade do Pai, pois ela vos alimentará e sempre estarás saciado por ela</w:t>
+      </w:r>
+      <w:r>
+        <w:rPr>
+          <w:b/>
+          <w:bCs/>
+        </w:rPr>
+        <w:t>.</w:t>
       </w:r>
     </w:p>
     <w:p>
@@ -805,6 +653,167 @@
           <w:b/>
           <w:bCs/>
         </w:rPr>
+        <w:t>Ainda quero dizer-te que</w:t>
+      </w:r>
+      <w:r>
+        <w:rPr>
+          <w:b/>
+          <w:bCs/>
+        </w:rPr>
+        <w:t xml:space="preserve"> em Roma será feito um laço com a impiedade, e será visto isso por todos, será noticiado e se verá claramente pelos frutos</w:t>
+      </w:r>
+      <w:r>
+        <w:rPr>
+          <w:b/>
+          <w:bCs/>
+        </w:rPr>
+        <w:t xml:space="preserve">, pois o Homem Iníquo </w:t>
+      </w:r>
+      <w:r>
+        <w:t>(falado nas escrituras)</w:t>
+      </w:r>
+      <w:r>
+        <w:t xml:space="preserve"> </w:t>
+      </w:r>
+      <w:r>
+        <w:rPr>
+          <w:b/>
+          <w:bCs/>
+        </w:rPr>
+        <w:t>em muito breve aparecerá, porá suas garras em Minha Roma ferida</w:t>
+      </w:r>
+      <w:r>
+        <w:rPr>
+          <w:b/>
+          <w:bCs/>
+        </w:rPr>
+        <w:t xml:space="preserve"> pela apostasia, e relembrará vivamente aos Homens que</w:t>
+      </w:r>
+      <w:r>
+        <w:rPr>
+          <w:b/>
+          <w:bCs/>
+        </w:rPr>
+        <w:t xml:space="preserve"> povoam a Terra que realmente os poderes do </w:t>
+      </w:r>
+      <w:r>
+        <w:rPr>
+          <w:b/>
+          <w:bCs/>
+        </w:rPr>
+        <w:t>c</w:t>
+      </w:r>
+      <w:r>
+        <w:rPr>
+          <w:b/>
+          <w:bCs/>
+        </w:rPr>
+        <w:t>éu</w:t>
+      </w:r>
+      <w:r>
+        <w:rPr>
+          <w:b/>
+          <w:bCs/>
+        </w:rPr>
+        <w:t>s</w:t>
+      </w:r>
+      <w:r>
+        <w:rPr>
+          <w:b/>
+          <w:bCs/>
+        </w:rPr>
+        <w:t xml:space="preserve"> </w:t>
+      </w:r>
+      <w:r>
+        <w:rPr>
+          <w:b/>
+          <w:bCs/>
+        </w:rPr>
+        <w:t>em verdade</w:t>
+      </w:r>
+      <w:r>
+        <w:rPr>
+          <w:b/>
+          <w:bCs/>
+        </w:rPr>
+        <w:t xml:space="preserve"> estão abalados e que a iniquidade avançou já a um grau ao qual precisará retroceder</w:t>
+      </w:r>
+      <w:r>
+        <w:rPr>
+          <w:b/>
+          <w:bCs/>
+        </w:rPr>
+        <w:t xml:space="preserve"> para que não seja tarde demais, e farei com que retroceda, pois começarei a desfazer, definitivamente, o </w:t>
+      </w:r>
+      <w:r>
+        <w:rPr>
+          <w:b/>
+          <w:bCs/>
+        </w:rPr>
+        <w:t xml:space="preserve">caminho do pecado até o coração dos Homens, e aos que se arrependerem, será dada a paz, mais aos que não se </w:t>
+      </w:r>
+      <w:r>
+        <w:rPr>
+          <w:b/>
+          <w:bCs/>
+        </w:rPr>
+        <w:t>arrependerem</w:t>
+      </w:r>
+      <w:r>
+        <w:rPr>
+          <w:b/>
+          <w:bCs/>
+        </w:rPr>
+        <w:t>, virá a grande tribulação</w:t>
+      </w:r>
+      <w:r>
+        <w:rPr>
+          <w:b/>
+          <w:bCs/>
+        </w:rPr>
+        <w:t xml:space="preserve"> que predisse no Santo Evangelho</w:t>
+      </w:r>
+      <w:r>
+        <w:rPr>
+          <w:b/>
+          <w:bCs/>
+        </w:rPr>
+        <w:t xml:space="preserve">, e haverá esperança, porém, não passará esse tempo sem que existam dores de parto e choro </w:t>
+      </w:r>
+      <w:r>
+        <w:rPr>
+          <w:b/>
+          <w:bCs/>
+        </w:rPr>
+        <w:t>a muitos em toda a face da Terra.</w:t>
+      </w:r>
+      <w:r>
+        <w:rPr>
+          <w:b/>
+          <w:bCs/>
+        </w:rPr>
+        <w:t xml:space="preserve"> </w:t>
+      </w:r>
+      <w:r>
+        <w:rPr>
+          <w:b/>
+          <w:bCs/>
+        </w:rPr>
+        <w:t xml:space="preserve"> </w:t>
+      </w:r>
+    </w:p>
+    <w:p>
+      <w:pPr>
+        <w:rPr>
+          <w:b/>
+          <w:bCs/>
+        </w:rPr>
+      </w:pPr>
+      <w:r>
+        <w:rPr>
+          <w:b/>
+          <w:bCs/>
+        </w:rPr>
         <w:t xml:space="preserve">O Espírito Santo precederá o Meu Glorioso Retorno, e para tanto o envio já, formando um povo Santo </w:t>
       </w:r>
       <w:r>
@@ -910,7 +919,15 @@
           <w:b/>
           <w:bCs/>
         </w:rPr>
-        <w:t>quando for seguro diante do tempo feroz em que</w:t>
+        <w:t xml:space="preserve">quando for seguro </w:t>
+      </w:r>
+      <w:r>
+        <w:rPr>
+          <w:b/>
+          <w:bCs/>
+        </w:rPr>
+        <w:lastRenderedPageBreak/>
+        <w:t>diante do tempo feroz em que</w:t>
       </w:r>
       <w:r>
         <w:rPr>

</xml_diff>